<commit_message>
McKinsey proposal: delivery 10-20 days from payment; layout cleanup
- Delivery term updated to 10–20 working days from payment (summary, metric
  band, commercial-terms table).
- Fixed metric-tile overflow (smaller number size so ranges don't wrap).
- Header now uses the clean WayStar logo instead of the tiny unreadable
  masthead with contact block.
- Cards get a clean blue top-accent rule; removed stray bordered paragraph.
- Cover 'recipient' shown as a proper gray placeholder instead of raw
  underscores; tidied exhibit captions.

Co-Authored-By: Claude Opus 4.8 <noreply@anthropic.com>
Claude-Session: https://claude.ai/code/session_01GqcCxA4ojtMTE5fuNdCJxF
</commit_message>
<xml_diff>
--- a/waystar-proposal/WayStar_KP_maslo_FOB_McKinsey.docx
+++ b/waystar-proposal/WayStar_KP_maslo_FOB_McKinsey.docx
@@ -183,13 +183,15 @@
             <w:r>
               <w:rPr>
                 <w:rFonts w:ascii="Montserrat" w:cs="Montserrat" w:eastAsia="Montserrat" w:hAnsi="Montserrat"/>
-                <w:b/>
-                <w:bCs/>
-                <w:color w:val="1D2733"/>
+                <w:b w:val="false"/>
+                <w:bCs w:val="false"/>
+                <w:i/>
+                <w:iCs/>
+                <w:color w:val="6B7682"/>
                 <w:sz w:val="21"/>
                 <w:szCs w:val="21"/>
               </w:rPr>
-              <w:t xml:space="preserve">_____________________________</w:t>
+              <w:t xml:space="preserve">наименование покупателя</w:t>
             </w:r>
           </w:p>
         </w:tc>
@@ -256,6 +258,8 @@
                 <w:rFonts w:ascii="Montserrat" w:cs="Montserrat" w:eastAsia="Montserrat" w:hAnsi="Montserrat"/>
                 <w:b/>
                 <w:bCs/>
+                <w:i w:val="false"/>
+                <w:iCs w:val="false"/>
                 <w:color w:val="1D2733"/>
                 <w:sz w:val="21"/>
                 <w:szCs w:val="21"/>
@@ -297,7 +301,7 @@
                 <w:sz w:val="16"/>
                 <w:szCs w:val="16"/>
               </w:rPr>
-              <w:t xml:space="preserve">ДЕЙСТВИТЕЛЬНО</w:t>
+              <w:t xml:space="preserve">ЦЕНА ДЕЙСТВИТЕЛЬНА</w:t>
             </w:r>
           </w:p>
         </w:tc>
@@ -327,6 +331,8 @@
                 <w:rFonts w:ascii="Montserrat" w:cs="Montserrat" w:eastAsia="Montserrat" w:hAnsi="Montserrat"/>
                 <w:b/>
                 <w:bCs/>
+                <w:i w:val="false"/>
+                <w:iCs w:val="false"/>
                 <w:color w:val="1D2733"/>
                 <w:sz w:val="21"/>
                 <w:szCs w:val="21"/>
@@ -398,6 +404,8 @@
                 <w:rFonts w:ascii="Montserrat" w:cs="Montserrat" w:eastAsia="Montserrat" w:hAnsi="Montserrat"/>
                 <w:b/>
                 <w:bCs/>
+                <w:i w:val="false"/>
+                <w:iCs w:val="false"/>
                 <w:color w:val="1D2733"/>
                 <w:sz w:val="21"/>
                 <w:szCs w:val="21"/>
@@ -488,7 +496,7 @@
           <w:sz w:val="30"/>
           <w:szCs w:val="30"/>
         </w:rPr>
-        <w:t xml:space="preserve">WayStar Group поставит 3 000–5 000 тонн подсолнечного масла на условиях FOB Актау в течение 5–10 рабочих дней с даты предоплаты.</w:t>
+        <w:t xml:space="preserve">WayStar Group поставит 3 000–5 000 тонн подсолнечного масла на условиях FOB Актау в течение 10–20 рабочих дней с момента оплаты.</w:t>
       </w:r>
     </w:p>
     <w:p>
@@ -654,7 +662,7 @@
             <w:shd w:fill="0A3B6B" w:color="auto" w:val="clear"/>
             <w:tcMar>
               <w:top w:type="dxa" w:w="150"/>
-              <w:left w:type="dxa" w:w="170"/>
+              <w:left w:type="dxa" w:w="150"/>
               <w:bottom w:type="dxa" w:w="150"/>
               <w:right w:type="dxa" w:w="130"/>
             </w:tcMar>
@@ -662,7 +670,7 @@
           </w:tcPr>
           <w:p>
             <w:pPr>
-              <w:spacing w:after="20" w:line="240" w:lineRule="auto"/>
+              <w:spacing w:after="26" w:line="236" w:lineRule="auto"/>
               <w:jc w:val="left"/>
             </w:pPr>
             <w:r>
@@ -671,8 +679,8 @@
                 <w:b/>
                 <w:bCs/>
                 <w:color w:val="FFFFFF"/>
-                <w:sz w:val="40"/>
-                <w:szCs w:val="40"/>
+                <w:sz w:val="28"/>
+                <w:szCs w:val="28"/>
               </w:rPr>
               <w:t xml:space="preserve">1 380–1 410</w:t>
             </w:r>
@@ -682,26 +690,83 @@
                 <w:b/>
                 <w:bCs/>
                 <w:color w:val="BFD6EE"/>
-                <w:sz w:val="18"/>
-                <w:szCs w:val="18"/>
+                <w:sz w:val="16"/>
+                <w:szCs w:val="16"/>
               </w:rPr>
               <w:t xml:space="preserve"> USD/т</w:t>
             </w:r>
           </w:p>
           <w:p>
             <w:pPr>
-              <w:spacing w:after="0" w:line="220" w:lineRule="auto"/>
+              <w:spacing w:after="0" w:line="216" w:lineRule="auto"/>
             </w:pPr>
             <w:r>
               <w:rPr>
                 <w:rFonts w:ascii="Montserrat" w:cs="Montserrat" w:eastAsia="Montserrat" w:hAnsi="Montserrat"/>
                 <w:caps/>
                 <w:color w:val="CFE0F1"/>
-                <w:spacing w:val="16"/>
+                <w:spacing w:val="14"/>
+                <w:sz w:val="15"/>
+                <w:szCs w:val="15"/>
+              </w:rPr>
+              <w:t xml:space="preserve">Цена (FOB)</w:t>
+            </w:r>
+          </w:p>
+        </w:tc>
+        <w:tc>
+          <w:tcPr>
+            <w:tcW w:type="dxa" w:w="2338"/>
+            <w:shd w:fill="0A3B6B" w:color="auto" w:val="clear"/>
+            <w:tcMar>
+              <w:top w:type="dxa" w:w="150"/>
+              <w:left w:type="dxa" w:w="150"/>
+              <w:bottom w:type="dxa" w:w="150"/>
+              <w:right w:type="dxa" w:w="130"/>
+            </w:tcMar>
+            <w:vAlign w:val="top"/>
+          </w:tcPr>
+          <w:p>
+            <w:pPr>
+              <w:spacing w:after="26" w:line="236" w:lineRule="auto"/>
+              <w:jc w:val="left"/>
+            </w:pPr>
+            <w:r>
+              <w:rPr>
+                <w:rFonts w:ascii="Montserrat" w:cs="Montserrat" w:eastAsia="Montserrat" w:hAnsi="Montserrat"/>
+                <w:b/>
+                <w:bCs/>
+                <w:color w:val="FFFFFF"/>
+                <w:sz w:val="28"/>
+                <w:szCs w:val="28"/>
+              </w:rPr>
+              <w:t xml:space="preserve">3 000–5 000</w:t>
+            </w:r>
+            <w:r>
+              <w:rPr>
+                <w:rFonts w:ascii="Montserrat" w:cs="Montserrat" w:eastAsia="Montserrat" w:hAnsi="Montserrat"/>
+                <w:b/>
+                <w:bCs/>
+                <w:color w:val="BFD6EE"/>
                 <w:sz w:val="16"/>
                 <w:szCs w:val="16"/>
               </w:rPr>
-              <w:t xml:space="preserve">Цена, FOB Актау</w:t>
+              <w:t xml:space="preserve"> т</w:t>
+            </w:r>
+          </w:p>
+          <w:p>
+            <w:pPr>
+              <w:spacing w:after="0" w:line="216" w:lineRule="auto"/>
+            </w:pPr>
+            <w:r>
+              <w:rPr>
+                <w:rFonts w:ascii="Montserrat" w:cs="Montserrat" w:eastAsia="Montserrat" w:hAnsi="Montserrat"/>
+                <w:caps/>
+                <w:color w:val="CFE0F1"/>
+                <w:spacing w:val="14"/>
+                <w:sz w:val="15"/>
+                <w:szCs w:val="15"/>
+              </w:rPr>
+              <w:t xml:space="preserve">Объём</w:t>
             </w:r>
           </w:p>
         </w:tc>
@@ -711,7 +776,7 @@
             <w:shd w:fill="0A3B6B" w:color="auto" w:val="clear"/>
             <w:tcMar>
               <w:top w:type="dxa" w:w="150"/>
-              <w:left w:type="dxa" w:w="170"/>
+              <w:left w:type="dxa" w:w="150"/>
               <w:bottom w:type="dxa" w:w="150"/>
               <w:right w:type="dxa" w:w="130"/>
             </w:tcMar>
@@ -719,7 +784,7 @@
           </w:tcPr>
           <w:p>
             <w:pPr>
-              <w:spacing w:after="20" w:line="240" w:lineRule="auto"/>
+              <w:spacing w:after="26" w:line="236" w:lineRule="auto"/>
               <w:jc w:val="left"/>
             </w:pPr>
             <w:r>
@@ -728,10 +793,10 @@
                 <w:b/>
                 <w:bCs/>
                 <w:color w:val="FFFFFF"/>
-                <w:sz w:val="40"/>
-                <w:szCs w:val="40"/>
-              </w:rPr>
-              <w:t xml:space="preserve">3 000–5 000</w:t>
+                <w:sz w:val="28"/>
+                <w:szCs w:val="28"/>
+              </w:rPr>
+              <w:t xml:space="preserve">FOB</w:t>
             </w:r>
             <w:r>
               <w:rPr>
@@ -739,140 +804,83 @@
                 <w:b/>
                 <w:bCs/>
                 <w:color w:val="BFD6EE"/>
-                <w:sz w:val="18"/>
-                <w:szCs w:val="18"/>
-              </w:rPr>
-              <w:t xml:space="preserve"> тонн</w:t>
-            </w:r>
-          </w:p>
-          <w:p>
-            <w:pPr>
-              <w:spacing w:after="0" w:line="220" w:lineRule="auto"/>
+                <w:sz w:val="16"/>
+                <w:szCs w:val="16"/>
+              </w:rPr>
+              <w:t xml:space="preserve"/>
+            </w:r>
+          </w:p>
+          <w:p>
+            <w:pPr>
+              <w:spacing w:after="0" w:line="216" w:lineRule="auto"/>
             </w:pPr>
             <w:r>
               <w:rPr>
                 <w:rFonts w:ascii="Montserrat" w:cs="Montserrat" w:eastAsia="Montserrat" w:hAnsi="Montserrat"/>
                 <w:caps/>
                 <w:color w:val="CFE0F1"/>
-                <w:spacing w:val="16"/>
+                <w:spacing w:val="14"/>
+                <w:sz w:val="15"/>
+                <w:szCs w:val="15"/>
+              </w:rPr>
+              <w:t xml:space="preserve">Инкотермс 2020</w:t>
+            </w:r>
+          </w:p>
+        </w:tc>
+        <w:tc>
+          <w:tcPr>
+            <w:tcW w:type="dxa" w:w="2340"/>
+            <w:shd w:fill="0A3B6B" w:color="auto" w:val="clear"/>
+            <w:tcMar>
+              <w:top w:type="dxa" w:w="150"/>
+              <w:left w:type="dxa" w:w="150"/>
+              <w:bottom w:type="dxa" w:w="150"/>
+              <w:right w:type="dxa" w:w="130"/>
+            </w:tcMar>
+            <w:vAlign w:val="top"/>
+          </w:tcPr>
+          <w:p>
+            <w:pPr>
+              <w:spacing w:after="26" w:line="236" w:lineRule="auto"/>
+              <w:jc w:val="left"/>
+            </w:pPr>
+            <w:r>
+              <w:rPr>
+                <w:rFonts w:ascii="Montserrat" w:cs="Montserrat" w:eastAsia="Montserrat" w:hAnsi="Montserrat"/>
+                <w:b/>
+                <w:bCs/>
+                <w:color w:val="FFFFFF"/>
+                <w:sz w:val="28"/>
+                <w:szCs w:val="28"/>
+              </w:rPr>
+              <w:t xml:space="preserve">10–20</w:t>
+            </w:r>
+            <w:r>
+              <w:rPr>
+                <w:rFonts w:ascii="Montserrat" w:cs="Montserrat" w:eastAsia="Montserrat" w:hAnsi="Montserrat"/>
+                <w:b/>
+                <w:bCs/>
+                <w:color w:val="BFD6EE"/>
                 <w:sz w:val="16"/>
                 <w:szCs w:val="16"/>
               </w:rPr>
-              <w:t xml:space="preserve">Объём партии</w:t>
-            </w:r>
-          </w:p>
-        </w:tc>
-        <w:tc>
-          <w:tcPr>
-            <w:tcW w:type="dxa" w:w="2338"/>
-            <w:shd w:fill="0A3B6B" w:color="auto" w:val="clear"/>
-            <w:tcMar>
-              <w:top w:type="dxa" w:w="150"/>
-              <w:left w:type="dxa" w:w="170"/>
-              <w:bottom w:type="dxa" w:w="150"/>
-              <w:right w:type="dxa" w:w="130"/>
-            </w:tcMar>
-            <w:vAlign w:val="top"/>
-          </w:tcPr>
-          <w:p>
-            <w:pPr>
-              <w:spacing w:after="20" w:line="240" w:lineRule="auto"/>
-              <w:jc w:val="left"/>
-            </w:pPr>
-            <w:r>
-              <w:rPr>
-                <w:rFonts w:ascii="Montserrat" w:cs="Montserrat" w:eastAsia="Montserrat" w:hAnsi="Montserrat"/>
-                <w:b/>
-                <w:bCs/>
-                <w:color w:val="FFFFFF"/>
-                <w:sz w:val="40"/>
-                <w:szCs w:val="40"/>
-              </w:rPr>
-              <w:t xml:space="preserve">FOB</w:t>
-            </w:r>
-            <w:r>
-              <w:rPr>
-                <w:rFonts w:ascii="Montserrat" w:cs="Montserrat" w:eastAsia="Montserrat" w:hAnsi="Montserrat"/>
-                <w:b/>
-                <w:bCs/>
-                <w:color w:val="BFD6EE"/>
-                <w:sz w:val="18"/>
-                <w:szCs w:val="18"/>
-              </w:rPr>
-              <w:t xml:space="preserve"/>
-            </w:r>
-          </w:p>
-          <w:p>
-            <w:pPr>
-              <w:spacing w:after="0" w:line="220" w:lineRule="auto"/>
+              <w:t xml:space="preserve"> дней</w:t>
+            </w:r>
+          </w:p>
+          <w:p>
+            <w:pPr>
+              <w:spacing w:after="0" w:line="216" w:lineRule="auto"/>
             </w:pPr>
             <w:r>
               <w:rPr>
                 <w:rFonts w:ascii="Montserrat" w:cs="Montserrat" w:eastAsia="Montserrat" w:hAnsi="Montserrat"/>
                 <w:caps/>
                 <w:color w:val="CFE0F1"/>
-                <w:spacing w:val="16"/>
-                <w:sz w:val="16"/>
-                <w:szCs w:val="16"/>
-              </w:rPr>
-              <w:t xml:space="preserve">Инкотермс 2020</w:t>
-            </w:r>
-          </w:p>
-        </w:tc>
-        <w:tc>
-          <w:tcPr>
-            <w:tcW w:type="dxa" w:w="2340"/>
-            <w:shd w:fill="0A3B6B" w:color="auto" w:val="clear"/>
-            <w:tcMar>
-              <w:top w:type="dxa" w:w="150"/>
-              <w:left w:type="dxa" w:w="170"/>
-              <w:bottom w:type="dxa" w:w="150"/>
-              <w:right w:type="dxa" w:w="130"/>
-            </w:tcMar>
-            <w:vAlign w:val="top"/>
-          </w:tcPr>
-          <w:p>
-            <w:pPr>
-              <w:spacing w:after="20" w:line="240" w:lineRule="auto"/>
-              <w:jc w:val="left"/>
-            </w:pPr>
-            <w:r>
-              <w:rPr>
-                <w:rFonts w:ascii="Montserrat" w:cs="Montserrat" w:eastAsia="Montserrat" w:hAnsi="Montserrat"/>
-                <w:b/>
-                <w:bCs/>
-                <w:color w:val="FFFFFF"/>
-                <w:sz w:val="40"/>
-                <w:szCs w:val="40"/>
-              </w:rPr>
-              <w:t xml:space="preserve">5–10</w:t>
-            </w:r>
-            <w:r>
-              <w:rPr>
-                <w:rFonts w:ascii="Montserrat" w:cs="Montserrat" w:eastAsia="Montserrat" w:hAnsi="Montserrat"/>
-                <w:b/>
-                <w:bCs/>
-                <w:color w:val="BFD6EE"/>
-                <w:sz w:val="18"/>
-                <w:szCs w:val="18"/>
-              </w:rPr>
-              <w:t xml:space="preserve"> дней</w:t>
-            </w:r>
-          </w:p>
-          <w:p>
-            <w:pPr>
-              <w:spacing w:after="0" w:line="220" w:lineRule="auto"/>
-            </w:pPr>
-            <w:r>
-              <w:rPr>
-                <w:rFonts w:ascii="Montserrat" w:cs="Montserrat" w:eastAsia="Montserrat" w:hAnsi="Montserrat"/>
-                <w:caps/>
-                <w:color w:val="CFE0F1"/>
-                <w:spacing w:val="16"/>
-                <w:sz w:val="16"/>
-                <w:szCs w:val="16"/>
-              </w:rPr>
-              <w:t xml:space="preserve">Срок до порта</w:t>
+                <w:spacing w:val="14"/>
+                <w:sz w:val="15"/>
+                <w:szCs w:val="15"/>
+              </w:rPr>
+              <w:t xml:space="preserve">Срок с оплаты</w:t>
             </w:r>
           </w:p>
         </w:tc>
@@ -977,34 +985,24 @@
         <w:tc>
           <w:tcPr>
             <w:tcW w:type="dxa" w:w="2998"/>
+            <w:tcBorders>
+              <w:top w:val="single" w:color="1668B3" w:sz="26"/>
+              <w:left w:val="single" w:color="FFFFFF" w:sz="2"/>
+              <w:bottom w:val="single" w:color="FFFFFF" w:sz="2"/>
+              <w:right w:val="single" w:color="FFFFFF" w:sz="2"/>
+            </w:tcBorders>
             <w:shd w:fill="EEF3F8" w:color="auto" w:val="clear"/>
             <w:tcMar>
-              <w:top w:type="dxa" w:w="150"/>
-              <w:left w:type="dxa" w:w="150"/>
-              <w:bottom w:type="dxa" w:w="160"/>
-              <w:right w:type="dxa" w:w="150"/>
+              <w:top w:type="dxa" w:w="160"/>
+              <w:left w:type="dxa" w:w="160"/>
+              <w:bottom w:type="dxa" w:w="170"/>
+              <w:right w:type="dxa" w:w="160"/>
             </w:tcMar>
             <w:vAlign w:val="top"/>
           </w:tcPr>
           <w:p>
             <w:pPr>
-              <w:pBdr>
-                <w:bottom w:val="single" w:color="1668B3" w:sz="22" w:space="1"/>
-              </w:pBdr>
-              <w:spacing w:after="0" w:line="40" w:lineRule="auto"/>
-            </w:pPr>
-            <w:r>
-              <w:rPr>
-                <w:rFonts w:ascii="Montserrat" w:cs="Montserrat" w:eastAsia="Montserrat" w:hAnsi="Montserrat"/>
-                <w:sz w:val="4"/>
-                <w:szCs w:val="4"/>
-              </w:rPr>
-              <w:t xml:space="preserve"/>
-            </w:r>
-          </w:p>
-          <w:p>
-            <w:pPr>
-              <w:spacing w:after="60" w:before="120" w:line="240" w:lineRule="auto"/>
+              <w:spacing w:after="66" w:before="0" w:line="238" w:lineRule="auto"/>
             </w:pPr>
             <w:r>
               <w:rPr>
@@ -1055,34 +1053,24 @@
         <w:tc>
           <w:tcPr>
             <w:tcW w:type="dxa" w:w="2998"/>
+            <w:tcBorders>
+              <w:top w:val="single" w:color="1668B3" w:sz="26"/>
+              <w:left w:val="single" w:color="FFFFFF" w:sz="2"/>
+              <w:bottom w:val="single" w:color="FFFFFF" w:sz="2"/>
+              <w:right w:val="single" w:color="FFFFFF" w:sz="2"/>
+            </w:tcBorders>
             <w:shd w:fill="EEF3F8" w:color="auto" w:val="clear"/>
             <w:tcMar>
-              <w:top w:type="dxa" w:w="150"/>
-              <w:left w:type="dxa" w:w="150"/>
-              <w:bottom w:type="dxa" w:w="160"/>
-              <w:right w:type="dxa" w:w="150"/>
+              <w:top w:type="dxa" w:w="160"/>
+              <w:left w:type="dxa" w:w="160"/>
+              <w:bottom w:type="dxa" w:w="170"/>
+              <w:right w:type="dxa" w:w="160"/>
             </w:tcMar>
             <w:vAlign w:val="top"/>
           </w:tcPr>
           <w:p>
             <w:pPr>
-              <w:pBdr>
-                <w:bottom w:val="single" w:color="1668B3" w:sz="22" w:space="1"/>
-              </w:pBdr>
-              <w:spacing w:after="0" w:line="40" w:lineRule="auto"/>
-            </w:pPr>
-            <w:r>
-              <w:rPr>
-                <w:rFonts w:ascii="Montserrat" w:cs="Montserrat" w:eastAsia="Montserrat" w:hAnsi="Montserrat"/>
-                <w:sz w:val="4"/>
-                <w:szCs w:val="4"/>
-              </w:rPr>
-              <w:t xml:space="preserve"/>
-            </w:r>
-          </w:p>
-          <w:p>
-            <w:pPr>
-              <w:spacing w:after="60" w:before="120" w:line="240" w:lineRule="auto"/>
+              <w:spacing w:after="66" w:before="0" w:line="238" w:lineRule="auto"/>
             </w:pPr>
             <w:r>
               <w:rPr>
@@ -1133,34 +1121,24 @@
         <w:tc>
           <w:tcPr>
             <w:tcW w:type="dxa" w:w="2998"/>
+            <w:tcBorders>
+              <w:top w:val="single" w:color="1668B3" w:sz="26"/>
+              <w:left w:val="single" w:color="FFFFFF" w:sz="2"/>
+              <w:bottom w:val="single" w:color="FFFFFF" w:sz="2"/>
+              <w:right w:val="single" w:color="FFFFFF" w:sz="2"/>
+            </w:tcBorders>
             <w:shd w:fill="EEF3F8" w:color="auto" w:val="clear"/>
             <w:tcMar>
-              <w:top w:type="dxa" w:w="150"/>
-              <w:left w:type="dxa" w:w="150"/>
-              <w:bottom w:type="dxa" w:w="160"/>
-              <w:right w:type="dxa" w:w="150"/>
+              <w:top w:type="dxa" w:w="160"/>
+              <w:left w:type="dxa" w:w="160"/>
+              <w:bottom w:type="dxa" w:w="170"/>
+              <w:right w:type="dxa" w:w="160"/>
             </w:tcMar>
             <w:vAlign w:val="top"/>
           </w:tcPr>
           <w:p>
             <w:pPr>
-              <w:pBdr>
-                <w:bottom w:val="single" w:color="1668B3" w:sz="22" w:space="1"/>
-              </w:pBdr>
-              <w:spacing w:after="0" w:line="40" w:lineRule="auto"/>
-            </w:pPr>
-            <w:r>
-              <w:rPr>
-                <w:rFonts w:ascii="Montserrat" w:cs="Montserrat" w:eastAsia="Montserrat" w:hAnsi="Montserrat"/>
-                <w:sz w:val="4"/>
-                <w:szCs w:val="4"/>
-              </w:rPr>
-              <w:t xml:space="preserve"/>
-            </w:r>
-          </w:p>
-          <w:p>
-            <w:pPr>
-              <w:spacing w:after="60" w:before="120" w:line="240" w:lineRule="auto"/>
+              <w:spacing w:after="66" w:before="0" w:line="238" w:lineRule="auto"/>
             </w:pPr>
             <w:r>
               <w:rPr>
@@ -1220,7 +1198,7 @@
             <w:shd w:fill="0A3B6B" w:color="auto" w:val="clear"/>
             <w:tcMar>
               <w:top w:type="dxa" w:w="150"/>
-              <w:left w:type="dxa" w:w="170"/>
+              <w:left w:type="dxa" w:w="150"/>
               <w:bottom w:type="dxa" w:w="150"/>
               <w:right w:type="dxa" w:w="130"/>
             </w:tcMar>
@@ -1228,7 +1206,7 @@
           </w:tcPr>
           <w:p>
             <w:pPr>
-              <w:spacing w:after="20" w:line="240" w:lineRule="auto"/>
+              <w:spacing w:after="26" w:line="236" w:lineRule="auto"/>
               <w:jc w:val="left"/>
             </w:pPr>
             <w:r>
@@ -1237,8 +1215,8 @@
                 <w:b/>
                 <w:bCs/>
                 <w:color w:val="FFFFFF"/>
-                <w:sz w:val="40"/>
-                <w:szCs w:val="40"/>
+                <w:sz w:val="28"/>
+                <w:szCs w:val="28"/>
               </w:rPr>
               <w:t xml:space="preserve">200+</w:t>
             </w:r>
@@ -1248,26 +1226,83 @@
                 <w:b/>
                 <w:bCs/>
                 <w:color w:val="BFD6EE"/>
-                <w:sz w:val="18"/>
-                <w:szCs w:val="18"/>
+                <w:sz w:val="16"/>
+                <w:szCs w:val="16"/>
               </w:rPr>
               <w:t xml:space="preserve"/>
             </w:r>
           </w:p>
           <w:p>
             <w:pPr>
-              <w:spacing w:after="0" w:line="220" w:lineRule="auto"/>
+              <w:spacing w:after="0" w:line="216" w:lineRule="auto"/>
             </w:pPr>
             <w:r>
               <w:rPr>
                 <w:rFonts w:ascii="Montserrat" w:cs="Montserrat" w:eastAsia="Montserrat" w:hAnsi="Montserrat"/>
                 <w:caps/>
                 <w:color w:val="CFE0F1"/>
-                <w:spacing w:val="16"/>
+                <w:spacing w:val="14"/>
+                <w:sz w:val="15"/>
+                <w:szCs w:val="15"/>
+              </w:rPr>
+              <w:t xml:space="preserve">Маршрутов</w:t>
+            </w:r>
+          </w:p>
+        </w:tc>
+        <w:tc>
+          <w:tcPr>
+            <w:tcW w:type="dxa" w:w="3118"/>
+            <w:shd w:fill="0A3B6B" w:color="auto" w:val="clear"/>
+            <w:tcMar>
+              <w:top w:type="dxa" w:w="150"/>
+              <w:left w:type="dxa" w:w="150"/>
+              <w:bottom w:type="dxa" w:w="150"/>
+              <w:right w:type="dxa" w:w="130"/>
+            </w:tcMar>
+            <w:vAlign w:val="top"/>
+          </w:tcPr>
+          <w:p>
+            <w:pPr>
+              <w:spacing w:after="26" w:line="236" w:lineRule="auto"/>
+              <w:jc w:val="left"/>
+            </w:pPr>
+            <w:r>
+              <w:rPr>
+                <w:rFonts w:ascii="Montserrat" w:cs="Montserrat" w:eastAsia="Montserrat" w:hAnsi="Montserrat"/>
+                <w:b/>
+                <w:bCs/>
+                <w:color w:val="FFFFFF"/>
+                <w:sz w:val="28"/>
+                <w:szCs w:val="28"/>
+              </w:rPr>
+              <w:t xml:space="preserve">150 000</w:t>
+            </w:r>
+            <w:r>
+              <w:rPr>
+                <w:rFonts w:ascii="Montserrat" w:cs="Montserrat" w:eastAsia="Montserrat" w:hAnsi="Montserrat"/>
+                <w:b/>
+                <w:bCs/>
+                <w:color w:val="BFD6EE"/>
                 <w:sz w:val="16"/>
                 <w:szCs w:val="16"/>
               </w:rPr>
-              <w:t xml:space="preserve">Маршрутов</w:t>
+              <w:t xml:space="preserve"> т/мес</w:t>
+            </w:r>
+          </w:p>
+          <w:p>
+            <w:pPr>
+              <w:spacing w:after="0" w:line="216" w:lineRule="auto"/>
+            </w:pPr>
+            <w:r>
+              <w:rPr>
+                <w:rFonts w:ascii="Montserrat" w:cs="Montserrat" w:eastAsia="Montserrat" w:hAnsi="Montserrat"/>
+                <w:caps/>
+                <w:color w:val="CFE0F1"/>
+                <w:spacing w:val="14"/>
+                <w:sz w:val="15"/>
+                <w:szCs w:val="15"/>
+              </w:rPr>
+              <w:t xml:space="preserve">Перевозки</w:t>
             </w:r>
           </w:p>
         </w:tc>
@@ -1277,7 +1312,7 @@
             <w:shd w:fill="0A3B6B" w:color="auto" w:val="clear"/>
             <w:tcMar>
               <w:top w:type="dxa" w:w="150"/>
-              <w:left w:type="dxa" w:w="170"/>
+              <w:left w:type="dxa" w:w="150"/>
               <w:bottom w:type="dxa" w:w="150"/>
               <w:right w:type="dxa" w:w="130"/>
             </w:tcMar>
@@ -1285,7 +1320,7 @@
           </w:tcPr>
           <w:p>
             <w:pPr>
-              <w:spacing w:after="20" w:line="240" w:lineRule="auto"/>
+              <w:spacing w:after="26" w:line="236" w:lineRule="auto"/>
               <w:jc w:val="left"/>
             </w:pPr>
             <w:r>
@@ -1294,10 +1329,10 @@
                 <w:b/>
                 <w:bCs/>
                 <w:color w:val="FFFFFF"/>
-                <w:sz w:val="40"/>
-                <w:szCs w:val="40"/>
-              </w:rPr>
-              <w:t xml:space="preserve">150 000</w:t>
+                <w:sz w:val="28"/>
+                <w:szCs w:val="28"/>
+              </w:rPr>
+              <w:t xml:space="preserve">3</w:t>
             </w:r>
             <w:r>
               <w:rPr>
@@ -1305,83 +1340,26 @@
                 <w:b/>
                 <w:bCs/>
                 <w:color w:val="BFD6EE"/>
-                <w:sz w:val="18"/>
-                <w:szCs w:val="18"/>
-              </w:rPr>
-              <w:t xml:space="preserve"> т/мес</w:t>
-            </w:r>
-          </w:p>
-          <w:p>
-            <w:pPr>
-              <w:spacing w:after="0" w:line="220" w:lineRule="auto"/>
+                <w:sz w:val="16"/>
+                <w:szCs w:val="16"/>
+              </w:rPr>
+              <w:t xml:space="preserve"/>
+            </w:r>
+          </w:p>
+          <w:p>
+            <w:pPr>
+              <w:spacing w:after="0" w:line="216" w:lineRule="auto"/>
             </w:pPr>
             <w:r>
               <w:rPr>
                 <w:rFonts w:ascii="Montserrat" w:cs="Montserrat" w:eastAsia="Montserrat" w:hAnsi="Montserrat"/>
                 <w:caps/>
                 <w:color w:val="CFE0F1"/>
-                <w:spacing w:val="16"/>
-                <w:sz w:val="16"/>
-                <w:szCs w:val="16"/>
-              </w:rPr>
-              <w:t xml:space="preserve">Объём перевозок</w:t>
-            </w:r>
-          </w:p>
-        </w:tc>
-        <w:tc>
-          <w:tcPr>
-            <w:tcW w:type="dxa" w:w="3118"/>
-            <w:shd w:fill="0A3B6B" w:color="auto" w:val="clear"/>
-            <w:tcMar>
-              <w:top w:type="dxa" w:w="150"/>
-              <w:left w:type="dxa" w:w="170"/>
-              <w:bottom w:type="dxa" w:w="150"/>
-              <w:right w:type="dxa" w:w="130"/>
-            </w:tcMar>
-            <w:vAlign w:val="top"/>
-          </w:tcPr>
-          <w:p>
-            <w:pPr>
-              <w:spacing w:after="20" w:line="240" w:lineRule="auto"/>
-              <w:jc w:val="left"/>
-            </w:pPr>
-            <w:r>
-              <w:rPr>
-                <w:rFonts w:ascii="Montserrat" w:cs="Montserrat" w:eastAsia="Montserrat" w:hAnsi="Montserrat"/>
-                <w:b/>
-                <w:bCs/>
-                <w:color w:val="FFFFFF"/>
-                <w:sz w:val="40"/>
-                <w:szCs w:val="40"/>
-              </w:rPr>
-              <w:t xml:space="preserve">3</w:t>
-            </w:r>
-            <w:r>
-              <w:rPr>
-                <w:rFonts w:ascii="Montserrat" w:cs="Montserrat" w:eastAsia="Montserrat" w:hAnsi="Montserrat"/>
-                <w:b/>
-                <w:bCs/>
-                <w:color w:val="BFD6EE"/>
-                <w:sz w:val="18"/>
-                <w:szCs w:val="18"/>
-              </w:rPr>
-              <w:t xml:space="preserve"/>
-            </w:r>
-          </w:p>
-          <w:p>
-            <w:pPr>
-              <w:spacing w:after="0" w:line="220" w:lineRule="auto"/>
-            </w:pPr>
-            <w:r>
-              <w:rPr>
-                <w:rFonts w:ascii="Montserrat" w:cs="Montserrat" w:eastAsia="Montserrat" w:hAnsi="Montserrat"/>
-                <w:caps/>
-                <w:color w:val="CFE0F1"/>
-                <w:spacing w:val="16"/>
-                <w:sz w:val="16"/>
-                <w:szCs w:val="16"/>
-              </w:rPr>
-              <w:t xml:space="preserve">Направления бизнеса</w:t>
+                <w:spacing w:val="14"/>
+                <w:sz w:val="15"/>
+                <w:szCs w:val="15"/>
+              </w:rPr>
+              <w:t xml:space="preserve">Направления</w:t>
             </w:r>
           </w:p>
         </w:tc>
@@ -1465,19 +1443,18 @@
     </w:p>
     <w:p>
       <w:pPr>
-        <w:spacing w:after="80" w:before="0" w:line="220" w:lineRule="auto"/>
+        <w:spacing w:after="90" w:before="0" w:line="224" w:lineRule="auto"/>
       </w:pPr>
       <w:r>
         <w:rPr>
           <w:rFonts w:ascii="Montserrat" w:cs="Montserrat" w:eastAsia="Montserrat" w:hAnsi="Montserrat"/>
           <w:b/>
           <w:bCs/>
-          <w:color w:val="6B7682"/>
-          <w:spacing w:val="20"/>
-          <w:sz w:val="15"/>
-          <w:szCs w:val="15"/>
-        </w:rPr>
-        <w:t xml:space="preserve">ИЛЛЮСТРАЦИЯ</w:t>
+          <w:color w:val="1668B3"/>
+          <w:sz w:val="18"/>
+          <w:szCs w:val="18"/>
+        </w:rPr>
+        <w:t xml:space="preserve">▪  </w:t>
       </w:r>
       <w:r>
         <w:rPr>
@@ -1485,10 +1462,10 @@
           <w:b/>
           <w:bCs/>
           <w:color w:val="1D2733"/>
-          <w:sz w:val="19"/>
-          <w:szCs w:val="19"/>
-        </w:rPr>
-        <w:t xml:space="preserve">   Базовые технические характеристики</w:t>
+          <w:sz w:val="20"/>
+          <w:szCs w:val="20"/>
+        </w:rPr>
+        <w:t xml:space="preserve">Базовые технические характеристики</w:t>
       </w:r>
     </w:p>
     <w:tbl>
@@ -2005,19 +1982,18 @@
     </w:p>
     <w:p>
       <w:pPr>
-        <w:spacing w:after="80" w:before="0" w:line="220" w:lineRule="auto"/>
+        <w:spacing w:after="90" w:before="0" w:line="224" w:lineRule="auto"/>
       </w:pPr>
       <w:r>
         <w:rPr>
           <w:rFonts w:ascii="Montserrat" w:cs="Montserrat" w:eastAsia="Montserrat" w:hAnsi="Montserrat"/>
           <w:b/>
           <w:bCs/>
-          <w:color w:val="6B7682"/>
-          <w:spacing w:val="20"/>
-          <w:sz w:val="15"/>
-          <w:szCs w:val="15"/>
-        </w:rPr>
-        <w:t xml:space="preserve">ИЛЛЮСТРАЦИЯ</w:t>
+          <w:color w:val="1668B3"/>
+          <w:sz w:val="18"/>
+          <w:szCs w:val="18"/>
+        </w:rPr>
+        <w:t xml:space="preserve">▪  </w:t>
       </w:r>
       <w:r>
         <w:rPr>
@@ -2025,10 +2001,10 @@
           <w:b/>
           <w:bCs/>
           <w:color w:val="1D2733"/>
-          <w:sz w:val="19"/>
-          <w:szCs w:val="19"/>
-        </w:rPr>
-        <w:t xml:space="preserve">   Основные коммерческие условия</w:t>
+          <w:sz w:val="20"/>
+          <w:szCs w:val="20"/>
+        </w:rPr>
+        <w:t xml:space="preserve">Основные коммерческие условия</w:t>
       </w:r>
     </w:p>
     <w:tbl>
@@ -2628,7 +2604,7 @@
                 <w:sz w:val="21"/>
                 <w:szCs w:val="21"/>
               </w:rPr>
-              <w:t xml:space="preserve">5–10 рабочих дней с даты поступления предоплаты</w:t>
+              <w:t xml:space="preserve">10–20 рабочих дней с момента оплаты</w:t>
             </w:r>
           </w:p>
         </w:tc>
@@ -4008,7 +3984,7 @@
           <w:r>
             <w:drawing>
               <wp:inline distT="0" distB="0" distL="0" distR="0">
-                <wp:extent cx="1428750" cy="276225"/>
+                <wp:extent cx="1123950" cy="476250"/>
                 <wp:effectExtent t="0" r="0" b="0" l="0"/>
                 <wp:docPr id="1" name="" descr="" title=""/>
                 <wp:cNvGraphicFramePr>
@@ -4033,7 +4009,7 @@
                       <pic:spPr bwMode="auto">
                         <a:xfrm>
                           <a:off x="0" y="0"/>
-                          <a:ext cx="1428750" cy="276225"/>
+                          <a:ext cx="1123950" cy="476250"/>
                         </a:xfrm>
                         <a:prstGeom prst="rect">
                           <a:avLst/>

</xml_diff>

<commit_message>
Fix metric-tile overflow and spacing in McKinsey proposal
Verified layout by rendering the actual .docx (docx-preview in headless
Chromium, since LibreOffice conversion is broken in this env). Root cause of
the ragged key-metrics band: the inline unit made the price value wrap
('USD/т' dropped to a second line and pushed the label down). Reworked tiles
so the big number stands alone and the unit folds into the caption line
(e.g. 'USD/T · ЦЕНА'); increased tile padding. All four tiles now align.

Co-Authored-By: Claude Opus 4.8 <noreply@anthropic.com>
Claude-Session: https://claude.ai/code/session_01GqcCxA4ojtMTE5fuNdCJxF
</commit_message>
<xml_diff>
--- a/waystar-proposal/WayStar_KP_maslo_FOB_McKinsey.docx
+++ b/waystar-proposal/WayStar_KP_maslo_FOB_McKinsey.docx
@@ -661,16 +661,16 @@
             <w:tcW w:type="dxa" w:w="2338"/>
             <w:shd w:fill="0A3B6B" w:color="auto" w:val="clear"/>
             <w:tcMar>
-              <w:top w:type="dxa" w:w="150"/>
-              <w:left w:type="dxa" w:w="150"/>
-              <w:bottom w:type="dxa" w:w="150"/>
-              <w:right w:type="dxa" w:w="130"/>
+              <w:top w:type="dxa" w:w="190"/>
+              <w:left w:type="dxa" w:w="210"/>
+              <w:bottom w:type="dxa" w:w="190"/>
+              <w:right w:type="dxa" w:w="150"/>
             </w:tcMar>
             <w:vAlign w:val="top"/>
           </w:tcPr>
           <w:p>
             <w:pPr>
-              <w:spacing w:after="26" w:line="236" w:lineRule="auto"/>
+              <w:spacing w:after="34" w:line="248" w:lineRule="auto"/>
               <w:jc w:val="left"/>
             </w:pPr>
             <w:r>
@@ -684,32 +684,34 @@
               </w:rPr>
               <w:t xml:space="preserve">1 380–1 410</w:t>
             </w:r>
-            <w:r>
-              <w:rPr>
-                <w:rFonts w:ascii="Montserrat" w:cs="Montserrat" w:eastAsia="Montserrat" w:hAnsi="Montserrat"/>
-                <w:b/>
-                <w:bCs/>
-                <w:color w:val="BFD6EE"/>
-                <w:sz w:val="16"/>
-                <w:szCs w:val="16"/>
-              </w:rPr>
-              <w:t xml:space="preserve"> USD/т</w:t>
-            </w:r>
-          </w:p>
-          <w:p>
-            <w:pPr>
-              <w:spacing w:after="0" w:line="216" w:lineRule="auto"/>
-            </w:pPr>
+          </w:p>
+          <w:p>
+            <w:pPr>
+              <w:spacing w:after="0" w:line="214" w:lineRule="auto"/>
+            </w:pPr>
+            <w:r>
+              <w:rPr>
+                <w:rFonts w:ascii="Montserrat" w:cs="Montserrat" w:eastAsia="Montserrat" w:hAnsi="Montserrat"/>
+                <w:b/>
+                <w:bCs/>
+                <w:caps/>
+                <w:color w:val="AFCDEC"/>
+                <w:spacing w:val="10"/>
+                <w:sz w:val="15"/>
+                <w:szCs w:val="15"/>
+              </w:rPr>
+              <w:t xml:space="preserve">USD/т</w:t>
+            </w:r>
             <w:r>
               <w:rPr>
                 <w:rFonts w:ascii="Montserrat" w:cs="Montserrat" w:eastAsia="Montserrat" w:hAnsi="Montserrat"/>
                 <w:caps/>
                 <w:color w:val="CFE0F1"/>
-                <w:spacing w:val="14"/>
+                <w:spacing w:val="12"/>
                 <w:sz w:val="15"/>
                 <w:szCs w:val="15"/>
               </w:rPr>
-              <w:t xml:space="preserve">Цена (FOB)</w:t>
+              <w:t xml:space="preserve">  ·  Цена</w:t>
             </w:r>
           </w:p>
         </w:tc>
@@ -718,16 +720,16 @@
             <w:tcW w:type="dxa" w:w="2338"/>
             <w:shd w:fill="0A3B6B" w:color="auto" w:val="clear"/>
             <w:tcMar>
-              <w:top w:type="dxa" w:w="150"/>
-              <w:left w:type="dxa" w:w="150"/>
-              <w:bottom w:type="dxa" w:w="150"/>
-              <w:right w:type="dxa" w:w="130"/>
+              <w:top w:type="dxa" w:w="190"/>
+              <w:left w:type="dxa" w:w="210"/>
+              <w:bottom w:type="dxa" w:w="190"/>
+              <w:right w:type="dxa" w:w="150"/>
             </w:tcMar>
             <w:vAlign w:val="top"/>
           </w:tcPr>
           <w:p>
             <w:pPr>
-              <w:spacing w:after="26" w:line="236" w:lineRule="auto"/>
+              <w:spacing w:after="34" w:line="248" w:lineRule="auto"/>
               <w:jc w:val="left"/>
             </w:pPr>
             <w:r>
@@ -741,32 +743,34 @@
               </w:rPr>
               <w:t xml:space="preserve">3 000–5 000</w:t>
             </w:r>
-            <w:r>
-              <w:rPr>
-                <w:rFonts w:ascii="Montserrat" w:cs="Montserrat" w:eastAsia="Montserrat" w:hAnsi="Montserrat"/>
-                <w:b/>
-                <w:bCs/>
-                <w:color w:val="BFD6EE"/>
-                <w:sz w:val="16"/>
-                <w:szCs w:val="16"/>
-              </w:rPr>
-              <w:t xml:space="preserve"> т</w:t>
-            </w:r>
-          </w:p>
-          <w:p>
-            <w:pPr>
-              <w:spacing w:after="0" w:line="216" w:lineRule="auto"/>
-            </w:pPr>
+          </w:p>
+          <w:p>
+            <w:pPr>
+              <w:spacing w:after="0" w:line="214" w:lineRule="auto"/>
+            </w:pPr>
+            <w:r>
+              <w:rPr>
+                <w:rFonts w:ascii="Montserrat" w:cs="Montserrat" w:eastAsia="Montserrat" w:hAnsi="Montserrat"/>
+                <w:b/>
+                <w:bCs/>
+                <w:caps/>
+                <w:color w:val="AFCDEC"/>
+                <w:spacing w:val="10"/>
+                <w:sz w:val="15"/>
+                <w:szCs w:val="15"/>
+              </w:rPr>
+              <w:t xml:space="preserve">тонн</w:t>
+            </w:r>
             <w:r>
               <w:rPr>
                 <w:rFonts w:ascii="Montserrat" w:cs="Montserrat" w:eastAsia="Montserrat" w:hAnsi="Montserrat"/>
                 <w:caps/>
                 <w:color w:val="CFE0F1"/>
-                <w:spacing w:val="14"/>
+                <w:spacing w:val="12"/>
                 <w:sz w:val="15"/>
                 <w:szCs w:val="15"/>
               </w:rPr>
-              <w:t xml:space="preserve">Объём</w:t>
+              <w:t xml:space="preserve">  ·  Объём</w:t>
             </w:r>
           </w:p>
         </w:tc>
@@ -775,16 +779,16 @@
             <w:tcW w:type="dxa" w:w="2338"/>
             <w:shd w:fill="0A3B6B" w:color="auto" w:val="clear"/>
             <w:tcMar>
-              <w:top w:type="dxa" w:w="150"/>
-              <w:left w:type="dxa" w:w="150"/>
-              <w:bottom w:type="dxa" w:w="150"/>
-              <w:right w:type="dxa" w:w="130"/>
+              <w:top w:type="dxa" w:w="190"/>
+              <w:left w:type="dxa" w:w="210"/>
+              <w:bottom w:type="dxa" w:w="190"/>
+              <w:right w:type="dxa" w:w="150"/>
             </w:tcMar>
             <w:vAlign w:val="top"/>
           </w:tcPr>
           <w:p>
             <w:pPr>
-              <w:spacing w:after="26" w:line="236" w:lineRule="auto"/>
+              <w:spacing w:after="34" w:line="248" w:lineRule="auto"/>
               <w:jc w:val="left"/>
             </w:pPr>
             <w:r>
@@ -798,28 +802,17 @@
               </w:rPr>
               <w:t xml:space="preserve">FOB</w:t>
             </w:r>
-            <w:r>
-              <w:rPr>
-                <w:rFonts w:ascii="Montserrat" w:cs="Montserrat" w:eastAsia="Montserrat" w:hAnsi="Montserrat"/>
-                <w:b/>
-                <w:bCs/>
-                <w:color w:val="BFD6EE"/>
-                <w:sz w:val="16"/>
-                <w:szCs w:val="16"/>
-              </w:rPr>
-              <w:t xml:space="preserve"/>
-            </w:r>
-          </w:p>
-          <w:p>
-            <w:pPr>
-              <w:spacing w:after="0" w:line="216" w:lineRule="auto"/>
+          </w:p>
+          <w:p>
+            <w:pPr>
+              <w:spacing w:after="0" w:line="214" w:lineRule="auto"/>
             </w:pPr>
             <w:r>
               <w:rPr>
                 <w:rFonts w:ascii="Montserrat" w:cs="Montserrat" w:eastAsia="Montserrat" w:hAnsi="Montserrat"/>
                 <w:caps/>
                 <w:color w:val="CFE0F1"/>
-                <w:spacing w:val="14"/>
+                <w:spacing w:val="12"/>
                 <w:sz w:val="15"/>
                 <w:szCs w:val="15"/>
               </w:rPr>
@@ -832,16 +825,16 @@
             <w:tcW w:type="dxa" w:w="2340"/>
             <w:shd w:fill="0A3B6B" w:color="auto" w:val="clear"/>
             <w:tcMar>
-              <w:top w:type="dxa" w:w="150"/>
-              <w:left w:type="dxa" w:w="150"/>
-              <w:bottom w:type="dxa" w:w="150"/>
-              <w:right w:type="dxa" w:w="130"/>
+              <w:top w:type="dxa" w:w="190"/>
+              <w:left w:type="dxa" w:w="210"/>
+              <w:bottom w:type="dxa" w:w="190"/>
+              <w:right w:type="dxa" w:w="150"/>
             </w:tcMar>
             <w:vAlign w:val="top"/>
           </w:tcPr>
           <w:p>
             <w:pPr>
-              <w:spacing w:after="26" w:line="236" w:lineRule="auto"/>
+              <w:spacing w:after="34" w:line="248" w:lineRule="auto"/>
               <w:jc w:val="left"/>
             </w:pPr>
             <w:r>
@@ -855,32 +848,34 @@
               </w:rPr>
               <w:t xml:space="preserve">10–20</w:t>
             </w:r>
-            <w:r>
-              <w:rPr>
-                <w:rFonts w:ascii="Montserrat" w:cs="Montserrat" w:eastAsia="Montserrat" w:hAnsi="Montserrat"/>
-                <w:b/>
-                <w:bCs/>
-                <w:color w:val="BFD6EE"/>
-                <w:sz w:val="16"/>
-                <w:szCs w:val="16"/>
-              </w:rPr>
-              <w:t xml:space="preserve"> дней</w:t>
-            </w:r>
-          </w:p>
-          <w:p>
-            <w:pPr>
-              <w:spacing w:after="0" w:line="216" w:lineRule="auto"/>
-            </w:pPr>
+          </w:p>
+          <w:p>
+            <w:pPr>
+              <w:spacing w:after="0" w:line="214" w:lineRule="auto"/>
+            </w:pPr>
+            <w:r>
+              <w:rPr>
+                <w:rFonts w:ascii="Montserrat" w:cs="Montserrat" w:eastAsia="Montserrat" w:hAnsi="Montserrat"/>
+                <w:b/>
+                <w:bCs/>
+                <w:caps/>
+                <w:color w:val="AFCDEC"/>
+                <w:spacing w:val="10"/>
+                <w:sz w:val="15"/>
+                <w:szCs w:val="15"/>
+              </w:rPr>
+              <w:t xml:space="preserve">дней</w:t>
+            </w:r>
             <w:r>
               <w:rPr>
                 <w:rFonts w:ascii="Montserrat" w:cs="Montserrat" w:eastAsia="Montserrat" w:hAnsi="Montserrat"/>
                 <w:caps/>
                 <w:color w:val="CFE0F1"/>
-                <w:spacing w:val="14"/>
+                <w:spacing w:val="12"/>
                 <w:sz w:val="15"/>
                 <w:szCs w:val="15"/>
               </w:rPr>
-              <w:t xml:space="preserve">Срок с оплаты</w:t>
+              <w:t xml:space="preserve">  ·  С оплаты</w:t>
             </w:r>
           </w:p>
         </w:tc>
@@ -1197,16 +1192,16 @@
             <w:tcW w:type="dxa" w:w="3118"/>
             <w:shd w:fill="0A3B6B" w:color="auto" w:val="clear"/>
             <w:tcMar>
-              <w:top w:type="dxa" w:w="150"/>
-              <w:left w:type="dxa" w:w="150"/>
-              <w:bottom w:type="dxa" w:w="150"/>
-              <w:right w:type="dxa" w:w="130"/>
+              <w:top w:type="dxa" w:w="190"/>
+              <w:left w:type="dxa" w:w="210"/>
+              <w:bottom w:type="dxa" w:w="190"/>
+              <w:right w:type="dxa" w:w="150"/>
             </w:tcMar>
             <w:vAlign w:val="top"/>
           </w:tcPr>
           <w:p>
             <w:pPr>
-              <w:spacing w:after="26" w:line="236" w:lineRule="auto"/>
+              <w:spacing w:after="34" w:line="248" w:lineRule="auto"/>
               <w:jc w:val="left"/>
             </w:pPr>
             <w:r>
@@ -1220,28 +1215,17 @@
               </w:rPr>
               <w:t xml:space="preserve">200+</w:t>
             </w:r>
-            <w:r>
-              <w:rPr>
-                <w:rFonts w:ascii="Montserrat" w:cs="Montserrat" w:eastAsia="Montserrat" w:hAnsi="Montserrat"/>
-                <w:b/>
-                <w:bCs/>
-                <w:color w:val="BFD6EE"/>
-                <w:sz w:val="16"/>
-                <w:szCs w:val="16"/>
-              </w:rPr>
-              <w:t xml:space="preserve"/>
-            </w:r>
-          </w:p>
-          <w:p>
-            <w:pPr>
-              <w:spacing w:after="0" w:line="216" w:lineRule="auto"/>
+          </w:p>
+          <w:p>
+            <w:pPr>
+              <w:spacing w:after="0" w:line="214" w:lineRule="auto"/>
             </w:pPr>
             <w:r>
               <w:rPr>
                 <w:rFonts w:ascii="Montserrat" w:cs="Montserrat" w:eastAsia="Montserrat" w:hAnsi="Montserrat"/>
                 <w:caps/>
                 <w:color w:val="CFE0F1"/>
-                <w:spacing w:val="14"/>
+                <w:spacing w:val="12"/>
                 <w:sz w:val="15"/>
                 <w:szCs w:val="15"/>
               </w:rPr>
@@ -1254,16 +1238,16 @@
             <w:tcW w:type="dxa" w:w="3118"/>
             <w:shd w:fill="0A3B6B" w:color="auto" w:val="clear"/>
             <w:tcMar>
-              <w:top w:type="dxa" w:w="150"/>
-              <w:left w:type="dxa" w:w="150"/>
-              <w:bottom w:type="dxa" w:w="150"/>
-              <w:right w:type="dxa" w:w="130"/>
+              <w:top w:type="dxa" w:w="190"/>
+              <w:left w:type="dxa" w:w="210"/>
+              <w:bottom w:type="dxa" w:w="190"/>
+              <w:right w:type="dxa" w:w="150"/>
             </w:tcMar>
             <w:vAlign w:val="top"/>
           </w:tcPr>
           <w:p>
             <w:pPr>
-              <w:spacing w:after="26" w:line="236" w:lineRule="auto"/>
+              <w:spacing w:after="34" w:line="248" w:lineRule="auto"/>
               <w:jc w:val="left"/>
             </w:pPr>
             <w:r>
@@ -1277,32 +1261,34 @@
               </w:rPr>
               <w:t xml:space="preserve">150 000</w:t>
             </w:r>
-            <w:r>
-              <w:rPr>
-                <w:rFonts w:ascii="Montserrat" w:cs="Montserrat" w:eastAsia="Montserrat" w:hAnsi="Montserrat"/>
-                <w:b/>
-                <w:bCs/>
-                <w:color w:val="BFD6EE"/>
-                <w:sz w:val="16"/>
-                <w:szCs w:val="16"/>
-              </w:rPr>
-              <w:t xml:space="preserve"> т/мес</w:t>
-            </w:r>
-          </w:p>
-          <w:p>
-            <w:pPr>
-              <w:spacing w:after="0" w:line="216" w:lineRule="auto"/>
-            </w:pPr>
+          </w:p>
+          <w:p>
+            <w:pPr>
+              <w:spacing w:after="0" w:line="214" w:lineRule="auto"/>
+            </w:pPr>
+            <w:r>
+              <w:rPr>
+                <w:rFonts w:ascii="Montserrat" w:cs="Montserrat" w:eastAsia="Montserrat" w:hAnsi="Montserrat"/>
+                <w:b/>
+                <w:bCs/>
+                <w:caps/>
+                <w:color w:val="AFCDEC"/>
+                <w:spacing w:val="10"/>
+                <w:sz w:val="15"/>
+                <w:szCs w:val="15"/>
+              </w:rPr>
+              <w:t xml:space="preserve">т/мес</w:t>
+            </w:r>
             <w:r>
               <w:rPr>
                 <w:rFonts w:ascii="Montserrat" w:cs="Montserrat" w:eastAsia="Montserrat" w:hAnsi="Montserrat"/>
                 <w:caps/>
                 <w:color w:val="CFE0F1"/>
-                <w:spacing w:val="14"/>
+                <w:spacing w:val="12"/>
                 <w:sz w:val="15"/>
                 <w:szCs w:val="15"/>
               </w:rPr>
-              <w:t xml:space="preserve">Перевозки</w:t>
+              <w:t xml:space="preserve">  ·  Перевозки</w:t>
             </w:r>
           </w:p>
         </w:tc>
@@ -1311,16 +1297,16 @@
             <w:tcW w:type="dxa" w:w="3118"/>
             <w:shd w:fill="0A3B6B" w:color="auto" w:val="clear"/>
             <w:tcMar>
-              <w:top w:type="dxa" w:w="150"/>
-              <w:left w:type="dxa" w:w="150"/>
-              <w:bottom w:type="dxa" w:w="150"/>
-              <w:right w:type="dxa" w:w="130"/>
+              <w:top w:type="dxa" w:w="190"/>
+              <w:left w:type="dxa" w:w="210"/>
+              <w:bottom w:type="dxa" w:w="190"/>
+              <w:right w:type="dxa" w:w="150"/>
             </w:tcMar>
             <w:vAlign w:val="top"/>
           </w:tcPr>
           <w:p>
             <w:pPr>
-              <w:spacing w:after="26" w:line="236" w:lineRule="auto"/>
+              <w:spacing w:after="34" w:line="248" w:lineRule="auto"/>
               <w:jc w:val="left"/>
             </w:pPr>
             <w:r>
@@ -1334,32 +1320,21 @@
               </w:rPr>
               <w:t xml:space="preserve">3</w:t>
             </w:r>
-            <w:r>
-              <w:rPr>
-                <w:rFonts w:ascii="Montserrat" w:cs="Montserrat" w:eastAsia="Montserrat" w:hAnsi="Montserrat"/>
-                <w:b/>
-                <w:bCs/>
-                <w:color w:val="BFD6EE"/>
-                <w:sz w:val="16"/>
-                <w:szCs w:val="16"/>
-              </w:rPr>
-              <w:t xml:space="preserve"/>
-            </w:r>
-          </w:p>
-          <w:p>
-            <w:pPr>
-              <w:spacing w:after="0" w:line="216" w:lineRule="auto"/>
+          </w:p>
+          <w:p>
+            <w:pPr>
+              <w:spacing w:after="0" w:line="214" w:lineRule="auto"/>
             </w:pPr>
             <w:r>
               <w:rPr>
                 <w:rFonts w:ascii="Montserrat" w:cs="Montserrat" w:eastAsia="Montserrat" w:hAnsi="Montserrat"/>
                 <w:caps/>
                 <w:color w:val="CFE0F1"/>
-                <w:spacing w:val="14"/>
+                <w:spacing w:val="12"/>
                 <w:sz w:val="15"/>
                 <w:szCs w:val="15"/>
               </w:rPr>
-              <w:t xml:space="preserve">Направления</w:t>
+              <w:t xml:space="preserve">Направления бизнеса</w:t>
             </w:r>
           </w:p>
         </w:tc>

</xml_diff>